<commit_message>
Run tracker on 2026 policy rules with no counting back; update Graham email
- Settings Apply2026 = Yes (part-time 24+ eligible, 2 days at 5 years from 08/09/2026)
- PreSchemeCounts stays No: nobody counts service before 27/11/2017
- Notes for Isaac, Tyrell, Kyle updated; READ ME rules note updated
- Word email to Graham rewritten: tracker on 2026 policy, decisions listed

Co-Authored-By: Claude Fable 5.1 <noreply@anthropic.com>
Claude-Session: https://claude.ai/code/session_01EcDw2RdbzrHBowkHsXKDir
</commit_message>
<xml_diff>
--- a/Bonus Leave - 2017 scheme vs 2026 policy - email to Graham.docx
+++ b/Bonus Leave - 2017 scheme vs 2026 policy - email to Graham.docx
@@ -14,7 +14,7 @@
           <w:sz w:val="22"/>
           <w:szCs w:val="22"/>
         </w:rPr>
-        <w:t xml:space="preserve">Subject: Bonus Leave - 2017 scheme vs 2026 policy, and tracker corrected</w:t>
+        <w:t xml:space="preserve">Subject: Bonus Leave - 2017 scheme vs 2026 policy, and tracker correction</w:t>
       </w:r>
     </w:p>
     <w:p>
@@ -40,7 +40,7 @@
           <w:sz w:val="22"/>
           <w:szCs w:val="22"/>
         </w:rPr>
-        <w:t xml:space="preserve">As agreed in our meeting, the only change between the 2017 scheme and the 2026 policy that applies is that Bonus Leave is no longer paid out on termination. I have corrected the tracker to that basis: accruals now follow the 2017 scheme (CTS Additional Leave Bonus Scheme flowchart v1.0, announced 27/11/2017) in every respect except the payout, and nothing is counted back before the scheme start. For the record, here is where the two documents differ, so you can see what the 2026 wording would have changed if we had applied it.</w:t>
+        <w:t xml:space="preserve">In our meeting we agreed that the only change from the 2017 scheme to the 2026 policy should have been that Bonus Leave is no longer paid out on termination. When I compared the 2017 flowchart (CTS Additional Leave Bonus Scheme v1.0, announced 27/11/2017) against the 2026 policy, the 2026 wording changes more than that. The tracker is built on the 2026 policy as written, with one correction we agreed in the meeting: nobody counts service before the scheme started on 27/11/2017, so everyone employed before that date is treated as commencing on 27/11/2017 and we do not count back. Below is each difference with the two documents side by side, what the tracker currently does, and where I need your decision.</w:t>
       </w:r>
     </w:p>
     <w:p>
@@ -216,7 +216,7 @@
           <w:sz w:val="22"/>
           <w:szCs w:val="22"/>
         </w:rPr>
-        <w:t xml:space="preserve">Tracker: full-time only. Isaac Butterworth's part-time service from 2019 does not count; his full-time service runs from 19/01/2026 and his first day falls on 19/01/2029. Tyrell Shortt is not eligible. The HR tally had credited 9 days to Isaac and 1 to Tyrell on a part-time basis, which will need reversing.</w:t>
+        <w:t xml:space="preserve">Tracker: follows 2026. Isaac Butterworth's part-time service from 17/09/2019 (38 hours) counts, which gives him 9 days, the same as the HR tally. Tyrell Shortt (part-time, 38 hours) earned his first day on 31/08/2026. If you decide the 2017 rule stands, both drop out: Isaac's first day would then be 19/01/2029 and Tyrell would not be eligible.</w:t>
       </w:r>
     </w:p>
     <w:p>
@@ -392,7 +392,7 @@
           <w:sz w:val="22"/>
           <w:szCs w:val="22"/>
         </w:rPr>
-        <w:t xml:space="preserve">Tracker: one day, as per 2017. This matches the HR tally.</w:t>
+        <w:t xml:space="preserve">Tracker: one day for anyone whose 5-year anniversary fell before 08/09/2026 (the policy date), two days from then on. This matches the HR tally for everyone who has already passed 5 years.</w:t>
       </w:r>
     </w:p>
     <w:p>
@@ -481,7 +481,7 @@
           <w:sz w:val="22"/>
           <w:szCs w:val="22"/>
         </w:rPr>
-        <w:t xml:space="preserve">Tracker: not applied.</w:t>
+        <w:t xml:space="preserve">Tracker: applied for part-time staff on 24 hours or more. No part-time employee has reached 5 years yet, so it has not produced any accrual.</w:t>
       </w:r>
     </w:p>
     <w:p>
@@ -718,7 +718,7 @@
           <w:sz w:val="22"/>
           <w:szCs w:val="22"/>
         </w:rPr>
-        <w:t xml:space="preserve">Tracker: service counts from the full-time start date, or from 27/11/2017 for anyone employed before the scheme began. Nothing is counted back before the scheme start, so those staff reach 3 years on 27/11/2020 and 5 years on 27/11/2022.</w:t>
+        <w:t xml:space="preserve">Tracker: service counts from the first full-time or part-time start date (casual time never counts), or from 27/11/2017 for anyone employed before the scheme began. Nothing is counted back before the scheme start, so those staff reach 3 years on 27/11/2020 and 5 years on 27/11/2022. Parental leave and leave without pay are not yet paused in the tracker; let me know if any current staff have had an extended absence.</w:t>
       </w:r>
     </w:p>
     <w:p>
@@ -933,7 +933,7 @@
           <w:sz w:val="22"/>
           <w:szCs w:val="22"/>
         </w:rPr>
-        <w:t xml:space="preserve">The tracker has a single switch to apply the 2026 accrual changes if that decision is ever revisited. Separately, the eligibility letters I listed earlier still stand, with Isaac and Tyrell removed from that list under these rules.</w:t>
+        <w:t xml:space="preserve">Decisions I need from you: (1) confirm the 2026 policy applies as written, including part-time eligibility and two days at 5 years, or tell me only the payout change was intended, in which case I flip one switch in the tracker and Isaac and Tyrell come off the list; (2) whether the excess hours for Daniel, Duncan and Jordan stand as granted or are reversed. The eligibility letters I listed in my earlier email still stand.</w:t>
       </w:r>
     </w:p>
     <w:p>

</xml_diff>